<commit_message>
Strengthen dokladnaya: PyCharm freeze and IDE impossibility
Lead with unresponsive PC on PyCharm start; spell out blocked
Python/Django, Visual Studio/.NET and Android Studio due to 6 GB
RAM, HDD swap thrashing and dual-core CPU.

Co-authored-by: Uladislaus <Uladislaus@users.noreply.github.com>
</commit_message>
<xml_diff>
--- a/work/File/Dokladnaya_zapiska_obnovlenie_APK.docx
+++ b/work/File/Dokladnaya_zapiska_obnovlenie_APK.docx
@@ -142,7 +142,63 @@
           <w:b w:val="0"/>
           <w:sz w:val="28"/>
         </w:rPr>
-        <w:t>В связи с выполнением работ по разработке и сопровождению программного обеспечения (языки Python, C#, JavaScript/TypeScript; среды PyCharm, Visual Studio / Visual Studio Code; СУБД; компоненты ГИС «Метео»; веб-стек Django и др.) довожу до Вашего сведения, что имеющиеся автоматизированные рабочие места отдела разработки программных продуктов не обеспечивают стабильную работу ресурсоёмких сред разработки. При одновременном запуске IDE, браузера, локальных сервисов и средств сборки наблюдаются длительные задержки, принудительное использование файла подкачки, зависания и закрытие приложений, что увеличивает сроки выполнения поручений.</w:t>
+        <w:t>В связи с выполнением работ по разработке и сопровождению программного обеспечения довожу до Вашего сведения критическое ограничение автоматизированного рабочего места инженера-программиста.</w:t>
+      </w:r>
+    </w:p>
+    <w:p>
+      <w:pPr>
+        <w:spacing w:after="120" w:line="276" w:lineRule="auto"/>
+        <w:ind w:firstLine="709"/>
+      </w:pPr>
+      <w:r>
+        <w:rPr>
+          <w:rFonts w:ascii="Times New Roman" w:hAnsi="Times New Roman" w:eastAsia="Times New Roman"/>
+          <w:b w:val="0"/>
+          <w:sz w:val="28"/>
+        </w:rPr>
+        <w:t>При запуске среды разработки PyCharm компьютер фактически перестаёт отвечать на действия пользователя: интерфейс зависает, операции с клавиатурой и мышью выполняются с многосекундной (и большей) задержкой либо не выполняются вовсе, система уходит в состояние крайней нехватки ресурсов. В результате разработка и доработка программ и приложений с использованием языков и стеков, для которых PyCharm является основным инструментом (в первую очередь Python, Django и смежные задачи), на данном рабочем месте становится практически невозможной.</w:t>
+      </w:r>
+    </w:p>
+    <w:p>
+      <w:pPr>
+        <w:spacing w:after="120" w:line="276" w:lineRule="auto"/>
+        <w:ind w:firstLine="709"/>
+      </w:pPr>
+      <w:r>
+        <w:rPr>
+          <w:rFonts w:ascii="Times New Roman" w:hAnsi="Times New Roman" w:eastAsia="Times New Roman"/>
+          <w:b w:val="0"/>
+          <w:sz w:val="28"/>
+        </w:rPr>
+        <w:t>Аналогичным образом недоступна (либо крайне ограничена) разработка с использованием Visual Studio: текущая конфигурация ПК не способна обеспечить устойчивый запуск и работу данной среды, что напрямую ограничивает возможность выполнения задач на платформе .NET / C# и смежных технологиях. Запуск Android Studio по тем же причинам на имеющемся оборудовании невозможен — ПК не выдерживает даже старт указанных сред разработки, не говоря уже о полноценной работе с проектами, эмуляторами и сборкой.</w:t>
+      </w:r>
+    </w:p>
+    <w:p>
+      <w:pPr>
+        <w:spacing w:after="120" w:line="276" w:lineRule="auto"/>
+        <w:ind w:firstLine="709"/>
+      </w:pPr>
+      <w:r>
+        <w:rPr>
+          <w:rFonts w:ascii="Times New Roman" w:hAnsi="Times New Roman" w:eastAsia="Times New Roman"/>
+          <w:b w:val="0"/>
+          <w:sz w:val="28"/>
+        </w:rPr>
+        <w:t>Указанные ограничения обусловлены системными характеристиками текущего АРМ: процессор Intel Pentium G2030 (2 ядра, 3,0 ГГц), оперативная память всего 6 ГБ и, как правило, накопитель на базе HDD. Объёма 6 ГБ ОЗУ недостаточно даже для одновременной работы современной IDE, операционной системы и браузера с документацией: память заполняется полностью, активируется интенсивный файл подкачки. Наличие HDD в сочетании с подкачкой приводит к длительной блокировке диска (активность 100 %), «замиранию» системы и фактической остановке работы. Двухядерный процессор 2013 года не обеспечивает параллельную индексацию кода, сборку и фоновые процессы IDE.</w:t>
+      </w:r>
+    </w:p>
+    <w:p>
+      <w:pPr>
+        <w:spacing w:after="120" w:line="276" w:lineRule="auto"/>
+        <w:ind w:firstLine="709"/>
+      </w:pPr>
+      <w:r>
+        <w:rPr>
+          <w:rFonts w:ascii="Times New Roman" w:hAnsi="Times New Roman" w:eastAsia="Times New Roman"/>
+          <w:b w:val="0"/>
+          <w:sz w:val="28"/>
+        </w:rPr>
+        <w:t>В совокупности это означает, что рабочее место не соответствует требованиям к должности инженера-программиста и не позволяет выполнять поручения по разработке ПО в установленные сроки.</w:t>
       </w:r>
     </w:p>
     <w:p>
@@ -197,7 +253,7 @@
           <w:b w:val="0"/>
           <w:sz w:val="28"/>
         </w:rPr>
-        <w:t>На используемом в настоящее время рабочем месте установлены: процессор Intel Pentium G2030 (2 ядра, 3,0 ГГц), оперативная память 6 ГБ, _____________________ (тип и объём накопителя уточняется), монитор _____________________.</w:t>
+        <w:t>На используемом в настоящее время рабочем месте установлены: процессор Intel Pentium G2030 (2 ядра, 3,0 ГГц), оперативная память 6 ГБ, _____________________ (тип и объём накопителя; при наличии HDD — указать), монитор _____________________.</w:t>
       </w:r>
     </w:p>
     <w:p>
@@ -211,7 +267,7 @@
           <w:b w:val="0"/>
           <w:sz w:val="28"/>
         </w:rPr>
-        <w:t>Указанная конфигурация не позволяет в полном объёме выполнять должностные обязанности: среда PyCharm при работе с проектами Python/Django становится неотзывчивой, индексация и отладка затруднены; полноценная работа в Visual Studio (многопроектные решения, сборка) на данном АРМ практически невозможна; при типичной нагрузке оперативная память исчерпывается, система активно использует файл подкачки, что резко снижает производительность. Двухядерный процессор не соответствует требованиям к параллельной сборке, тестированию и фоновым задачам IDE.</w:t>
+        <w:t>Как указано выше, уже при попытке открыть PyCharm АРМ перестаёт нормально функционировать; Visual Studio и Android Studio на данной конфигурации фактически недоступны. Это исключает полноценную разработку на Python/Django, ограничивает работы на .NET / C# (Visual Studio) и полностью блокирует Android-разработку (Android Studio). Индексация проектов, отладка и одновременная работа с несколькими инструментами невозможны без зависаний.</w:t>
       </w:r>
     </w:p>
     <w:p>
@@ -225,7 +281,7 @@
           <w:b w:val="0"/>
           <w:sz w:val="28"/>
         </w:rPr>
-        <w:t>Дополнительное увеличение только объёма ОЗУ на платформе Pentium G2030 не устраняет ограничений по производительности процессора и, при наличии HDD, по скорости подсистемы хранения. Замена системного блока и монитора является технически обоснованной.</w:t>
+        <w:t>Дополнительное увеличение только объёма ОЗУ на платформе Pentium G2030 не устраняет ограничений по производительности процессора и, при наличии HDD, по скорости подсистемы хранения: даже при большем объёме памяти подкачка и фоновые задачи IDE будут упираться в медленный диск и устаревший CPU. Замена системного блока и монитора является технически обоснованной.</w:t>
       </w:r>
     </w:p>
     <w:p>
@@ -239,7 +295,7 @@
           <w:b w:val="0"/>
           <w:sz w:val="28"/>
         </w:rPr>
-        <w:t>Рекомендуемая конфигурация новой рабочей станции для согласования: процессор не ниже 4 физических ядер (Intel Core i5 / AMD Ryzen 5 или эквивалент по регламенту закупок); оперативная память 32 ГБ (минимум 16 ГБ); накопитель SSD не менее 512 ГБ; ОС Windows 10/11 (64-bit) в рамках лицензирования организации.</w:t>
+        <w:t>Рекомендуемая конфигурация новой рабочей станции для согласования: процессор не ниже 4 физических ядер (Intel Core i5 / AMD Ryzen 5 или эквивалент по регламенту закупок); оперативная память 32 ГБ (минимум 16 ГБ); накопитель SSD не менее 512 ГБ (обязательно SSD, не HDD); ОС Windows 10/11 (64-bit) в рамках лицензирования организации.</w:t>
       </w:r>
     </w:p>
     <w:p>
@@ -253,7 +309,7 @@
           <w:b w:val="0"/>
           <w:sz w:val="28"/>
         </w:rPr>
-        <w:t>Подтверждающие материалы (скриншоты диспетчера задач — память, ЦП, диск; сведения msinfo32) будут представлены дополнительно по запросу.</w:t>
+        <w:t>Подтверждающие материалы (скриншоты диспетчера задач — память, ЦП, диск при запуске PyCharm; сведения msinfo32) будут представлены дополнительно по запросу.</w:t>
       </w:r>
     </w:p>
     <w:p>

</xml_diff>